<commit_message>
Configured models and services for ebs_cleanup
</commit_message>
<xml_diff>
--- a/CI Workflows.docx
+++ b/CI Workflows.docx
@@ -1928,16 +1928,7 @@
     <w:p/>
     <w:p>
       <w:r>
-        <w:t xml:space="preserve">*) Optional </w:t>
-      </w:r>
-      <w:r>
-        <w:t xml:space="preserve">workflows in </w:t>
-      </w:r>
-      <w:r>
-        <w:t>when</w:t>
-      </w:r>
-      <w:r>
-        <w:t xml:space="preserve"> </w:t>
+        <w:t xml:space="preserve">*) Optional workflows in when </w:t>
       </w:r>
       <w:proofErr w:type="spellStart"/>
       <w:r>
@@ -1945,13 +1936,7 @@
       </w:r>
       <w:proofErr w:type="spellEnd"/>
       <w:r>
-        <w:t xml:space="preserve"> repo</w:t>
-      </w:r>
-      <w:r>
-        <w:t xml:space="preserve"> needs them</w:t>
-      </w:r>
-      <w:r>
-        <w:t>:</w:t>
+        <w:t xml:space="preserve"> repo needs them:</w:t>
       </w:r>
     </w:p>
     <w:tbl>
@@ -2570,8 +2555,6 @@
       <w:r>
         <w:t>Business Workflows</w:t>
       </w:r>
-      <w:bookmarkStart w:id="0" w:name="_GoBack"/>
-      <w:bookmarkEnd w:id="0"/>
     </w:p>
     <w:p>
       <w:r>
@@ -2653,6 +2636,1223 @@
       </w:r>
       <w:proofErr w:type="spellEnd"/>
     </w:p>
+    <w:p/>
+    <w:p>
+      <w:r>
+        <w:lastRenderedPageBreak/>
+        <w:t>*) Application pipeline quality gates:</w:t>
+      </w:r>
+      <w:bookmarkStart w:id="0" w:name="_GoBack"/>
+      <w:bookmarkEnd w:id="0"/>
+    </w:p>
+    <w:tbl>
+      <w:tblPr>
+        <w:tblW w:w="0" w:type="auto"/>
+        <w:tblCellSpacing w:w="15" w:type="dxa"/>
+        <w:tblCellMar>
+          <w:top w:w="15" w:type="dxa"/>
+          <w:left w:w="15" w:type="dxa"/>
+          <w:bottom w:w="15" w:type="dxa"/>
+          <w:right w:w="15" w:type="dxa"/>
+        </w:tblCellMar>
+        <w:tblLook w:val="04A0" w:firstRow="1" w:lastRow="0" w:firstColumn="1" w:lastColumn="0" w:noHBand="0" w:noVBand="1"/>
+      </w:tblPr>
+      <w:tblGrid>
+        <w:gridCol w:w="3048"/>
+        <w:gridCol w:w="1220"/>
+        <w:gridCol w:w="3461"/>
+      </w:tblGrid>
+      <w:tr>
+        <w:trPr>
+          <w:tblHeader/>
+          <w:tblCellSpacing w:w="15" w:type="dxa"/>
+        </w:trPr>
+        <w:tc>
+          <w:tcPr>
+            <w:tcW w:w="0" w:type="auto"/>
+            <w:vAlign w:val="center"/>
+            <w:hideMark/>
+          </w:tcPr>
+          <w:p>
+            <w:pPr>
+              <w:spacing w:after="0" w:line="240" w:lineRule="auto"/>
+              <w:jc w:val="center"/>
+              <w:rPr>
+                <w:rFonts w:ascii="Times New Roman" w:eastAsia="Times New Roman" w:hAnsi="Times New Roman" w:cs="Times New Roman"/>
+                <w:b/>
+                <w:bCs/>
+                <w:sz w:val="24"/>
+                <w:szCs w:val="24"/>
+                <w:lang w:eastAsia="en-IN"/>
+              </w:rPr>
+            </w:pPr>
+            <w:r>
+              <w:rPr>
+                <w:rFonts w:ascii="Times New Roman" w:eastAsia="Times New Roman" w:hAnsi="Times New Roman" w:cs="Times New Roman"/>
+                <w:b/>
+                <w:bCs/>
+                <w:sz w:val="24"/>
+                <w:szCs w:val="24"/>
+                <w:lang w:eastAsia="en-IN"/>
+              </w:rPr>
+              <w:t>Gate</w:t>
+            </w:r>
+          </w:p>
+        </w:tc>
+        <w:tc>
+          <w:tcPr>
+            <w:tcW w:w="0" w:type="auto"/>
+            <w:vAlign w:val="center"/>
+            <w:hideMark/>
+          </w:tcPr>
+          <w:p>
+            <w:pPr>
+              <w:spacing w:after="0" w:line="240" w:lineRule="auto"/>
+              <w:jc w:val="center"/>
+              <w:rPr>
+                <w:rFonts w:ascii="Times New Roman" w:eastAsia="Times New Roman" w:hAnsi="Times New Roman" w:cs="Times New Roman"/>
+                <w:b/>
+                <w:bCs/>
+                <w:sz w:val="24"/>
+                <w:szCs w:val="24"/>
+                <w:lang w:eastAsia="en-IN"/>
+              </w:rPr>
+            </w:pPr>
+            <w:r>
+              <w:rPr>
+                <w:rFonts w:ascii="Times New Roman" w:eastAsia="Times New Roman" w:hAnsi="Times New Roman" w:cs="Times New Roman"/>
+                <w:b/>
+                <w:bCs/>
+                <w:sz w:val="24"/>
+                <w:szCs w:val="24"/>
+                <w:lang w:eastAsia="en-IN"/>
+              </w:rPr>
+              <w:t>Mandatory</w:t>
+            </w:r>
+          </w:p>
+        </w:tc>
+        <w:tc>
+          <w:tcPr>
+            <w:tcW w:w="0" w:type="auto"/>
+            <w:vAlign w:val="center"/>
+            <w:hideMark/>
+          </w:tcPr>
+          <w:p>
+            <w:pPr>
+              <w:spacing w:after="0" w:line="240" w:lineRule="auto"/>
+              <w:jc w:val="center"/>
+              <w:rPr>
+                <w:rFonts w:ascii="Times New Roman" w:eastAsia="Times New Roman" w:hAnsi="Times New Roman" w:cs="Times New Roman"/>
+                <w:b/>
+                <w:bCs/>
+                <w:sz w:val="24"/>
+                <w:szCs w:val="24"/>
+                <w:lang w:eastAsia="en-IN"/>
+              </w:rPr>
+            </w:pPr>
+            <w:r>
+              <w:rPr>
+                <w:rFonts w:ascii="Times New Roman" w:eastAsia="Times New Roman" w:hAnsi="Times New Roman" w:cs="Times New Roman"/>
+                <w:b/>
+                <w:bCs/>
+                <w:sz w:val="24"/>
+                <w:szCs w:val="24"/>
+                <w:lang w:eastAsia="en-IN"/>
+              </w:rPr>
+              <w:t>Purpose</w:t>
+            </w:r>
+          </w:p>
+        </w:tc>
+      </w:tr>
+      <w:tr>
+        <w:trPr>
+          <w:tblCellSpacing w:w="15" w:type="dxa"/>
+        </w:trPr>
+        <w:tc>
+          <w:tcPr>
+            <w:tcW w:w="0" w:type="auto"/>
+            <w:vAlign w:val="center"/>
+            <w:hideMark/>
+          </w:tcPr>
+          <w:p>
+            <w:pPr>
+              <w:spacing w:after="0" w:line="240" w:lineRule="auto"/>
+              <w:rPr>
+                <w:rFonts w:ascii="Times New Roman" w:eastAsia="Times New Roman" w:hAnsi="Times New Roman" w:cs="Times New Roman"/>
+                <w:sz w:val="24"/>
+                <w:szCs w:val="24"/>
+                <w:lang w:eastAsia="en-IN"/>
+              </w:rPr>
+            </w:pPr>
+            <w:r>
+              <w:rPr>
+                <w:rFonts w:ascii="Times New Roman" w:eastAsia="Times New Roman" w:hAnsi="Times New Roman" w:cs="Times New Roman"/>
+                <w:sz w:val="24"/>
+                <w:szCs w:val="24"/>
+                <w:lang w:eastAsia="en-IN"/>
+              </w:rPr>
+              <w:t>Source checkout</w:t>
+            </w:r>
+          </w:p>
+        </w:tc>
+        <w:tc>
+          <w:tcPr>
+            <w:tcW w:w="0" w:type="auto"/>
+            <w:vAlign w:val="center"/>
+            <w:hideMark/>
+          </w:tcPr>
+          <w:p>
+            <w:pPr>
+              <w:spacing w:after="0" w:line="240" w:lineRule="auto"/>
+              <w:rPr>
+                <w:rFonts w:ascii="Times New Roman" w:eastAsia="Times New Roman" w:hAnsi="Times New Roman" w:cs="Times New Roman"/>
+                <w:sz w:val="24"/>
+                <w:szCs w:val="24"/>
+                <w:lang w:eastAsia="en-IN"/>
+              </w:rPr>
+            </w:pPr>
+            <w:r>
+              <w:rPr>
+                <w:rFonts w:ascii="Segoe UI Symbol" w:eastAsia="Times New Roman" w:hAnsi="Segoe UI Symbol" w:cs="Segoe UI Symbol"/>
+                <w:sz w:val="24"/>
+                <w:szCs w:val="24"/>
+                <w:lang w:eastAsia="en-IN"/>
+              </w:rPr>
+              <w:t>✅</w:t>
+            </w:r>
+          </w:p>
+        </w:tc>
+        <w:tc>
+          <w:tcPr>
+            <w:tcW w:w="0" w:type="auto"/>
+            <w:vAlign w:val="center"/>
+            <w:hideMark/>
+          </w:tcPr>
+          <w:p>
+            <w:pPr>
+              <w:spacing w:after="0" w:line="240" w:lineRule="auto"/>
+              <w:rPr>
+                <w:rFonts w:ascii="Times New Roman" w:eastAsia="Times New Roman" w:hAnsi="Times New Roman" w:cs="Times New Roman"/>
+                <w:sz w:val="24"/>
+                <w:szCs w:val="24"/>
+                <w:lang w:eastAsia="en-IN"/>
+              </w:rPr>
+            </w:pPr>
+            <w:r>
+              <w:rPr>
+                <w:rFonts w:ascii="Times New Roman" w:eastAsia="Times New Roman" w:hAnsi="Times New Roman" w:cs="Times New Roman"/>
+                <w:sz w:val="24"/>
+                <w:szCs w:val="24"/>
+                <w:lang w:eastAsia="en-IN"/>
+              </w:rPr>
+              <w:t>Correct commit/tag</w:t>
+            </w:r>
+          </w:p>
+        </w:tc>
+      </w:tr>
+      <w:tr>
+        <w:trPr>
+          <w:tblCellSpacing w:w="15" w:type="dxa"/>
+        </w:trPr>
+        <w:tc>
+          <w:tcPr>
+            <w:tcW w:w="0" w:type="auto"/>
+            <w:vAlign w:val="center"/>
+            <w:hideMark/>
+          </w:tcPr>
+          <w:p>
+            <w:pPr>
+              <w:spacing w:after="0" w:line="240" w:lineRule="auto"/>
+              <w:rPr>
+                <w:rFonts w:ascii="Times New Roman" w:eastAsia="Times New Roman" w:hAnsi="Times New Roman" w:cs="Times New Roman"/>
+                <w:sz w:val="24"/>
+                <w:szCs w:val="24"/>
+                <w:lang w:eastAsia="en-IN"/>
+              </w:rPr>
+            </w:pPr>
+            <w:r>
+              <w:rPr>
+                <w:rFonts w:ascii="Times New Roman" w:eastAsia="Times New Roman" w:hAnsi="Times New Roman" w:cs="Times New Roman"/>
+                <w:sz w:val="24"/>
+                <w:szCs w:val="24"/>
+                <w:lang w:eastAsia="en-IN"/>
+              </w:rPr>
+              <w:t>Maven compile</w:t>
+            </w:r>
+          </w:p>
+        </w:tc>
+        <w:tc>
+          <w:tcPr>
+            <w:tcW w:w="0" w:type="auto"/>
+            <w:vAlign w:val="center"/>
+            <w:hideMark/>
+          </w:tcPr>
+          <w:p>
+            <w:pPr>
+              <w:spacing w:after="0" w:line="240" w:lineRule="auto"/>
+              <w:rPr>
+                <w:rFonts w:ascii="Times New Roman" w:eastAsia="Times New Roman" w:hAnsi="Times New Roman" w:cs="Times New Roman"/>
+                <w:sz w:val="24"/>
+                <w:szCs w:val="24"/>
+                <w:lang w:eastAsia="en-IN"/>
+              </w:rPr>
+            </w:pPr>
+            <w:r>
+              <w:rPr>
+                <w:rFonts w:ascii="Segoe UI Symbol" w:eastAsia="Times New Roman" w:hAnsi="Segoe UI Symbol" w:cs="Segoe UI Symbol"/>
+                <w:sz w:val="24"/>
+                <w:szCs w:val="24"/>
+                <w:lang w:eastAsia="en-IN"/>
+              </w:rPr>
+              <w:t>✅</w:t>
+            </w:r>
+          </w:p>
+        </w:tc>
+        <w:tc>
+          <w:tcPr>
+            <w:tcW w:w="0" w:type="auto"/>
+            <w:vAlign w:val="center"/>
+            <w:hideMark/>
+          </w:tcPr>
+          <w:p>
+            <w:pPr>
+              <w:spacing w:after="0" w:line="240" w:lineRule="auto"/>
+              <w:rPr>
+                <w:rFonts w:ascii="Times New Roman" w:eastAsia="Times New Roman" w:hAnsi="Times New Roman" w:cs="Times New Roman"/>
+                <w:sz w:val="24"/>
+                <w:szCs w:val="24"/>
+                <w:lang w:eastAsia="en-IN"/>
+              </w:rPr>
+            </w:pPr>
+            <w:r>
+              <w:rPr>
+                <w:rFonts w:ascii="Times New Roman" w:eastAsia="Times New Roman" w:hAnsi="Times New Roman" w:cs="Times New Roman"/>
+                <w:sz w:val="24"/>
+                <w:szCs w:val="24"/>
+                <w:lang w:eastAsia="en-IN"/>
+              </w:rPr>
+              <w:t>Verify build</w:t>
+            </w:r>
+          </w:p>
+        </w:tc>
+      </w:tr>
+      <w:tr>
+        <w:trPr>
+          <w:tblCellSpacing w:w="15" w:type="dxa"/>
+        </w:trPr>
+        <w:tc>
+          <w:tcPr>
+            <w:tcW w:w="0" w:type="auto"/>
+            <w:vAlign w:val="center"/>
+            <w:hideMark/>
+          </w:tcPr>
+          <w:p>
+            <w:pPr>
+              <w:spacing w:after="0" w:line="240" w:lineRule="auto"/>
+              <w:rPr>
+                <w:rFonts w:ascii="Times New Roman" w:eastAsia="Times New Roman" w:hAnsi="Times New Roman" w:cs="Times New Roman"/>
+                <w:sz w:val="24"/>
+                <w:szCs w:val="24"/>
+                <w:lang w:eastAsia="en-IN"/>
+              </w:rPr>
+            </w:pPr>
+            <w:r>
+              <w:rPr>
+                <w:rFonts w:ascii="Times New Roman" w:eastAsia="Times New Roman" w:hAnsi="Times New Roman" w:cs="Times New Roman"/>
+                <w:sz w:val="24"/>
+                <w:szCs w:val="24"/>
+                <w:lang w:eastAsia="en-IN"/>
+              </w:rPr>
+              <w:t>Unit tests</w:t>
+            </w:r>
+          </w:p>
+        </w:tc>
+        <w:tc>
+          <w:tcPr>
+            <w:tcW w:w="0" w:type="auto"/>
+            <w:vAlign w:val="center"/>
+            <w:hideMark/>
+          </w:tcPr>
+          <w:p>
+            <w:pPr>
+              <w:spacing w:after="0" w:line="240" w:lineRule="auto"/>
+              <w:rPr>
+                <w:rFonts w:ascii="Times New Roman" w:eastAsia="Times New Roman" w:hAnsi="Times New Roman" w:cs="Times New Roman"/>
+                <w:sz w:val="24"/>
+                <w:szCs w:val="24"/>
+                <w:lang w:eastAsia="en-IN"/>
+              </w:rPr>
+            </w:pPr>
+            <w:r>
+              <w:rPr>
+                <w:rFonts w:ascii="Segoe UI Symbol" w:eastAsia="Times New Roman" w:hAnsi="Segoe UI Symbol" w:cs="Segoe UI Symbol"/>
+                <w:sz w:val="24"/>
+                <w:szCs w:val="24"/>
+                <w:lang w:eastAsia="en-IN"/>
+              </w:rPr>
+              <w:t>✅</w:t>
+            </w:r>
+          </w:p>
+        </w:tc>
+        <w:tc>
+          <w:tcPr>
+            <w:tcW w:w="0" w:type="auto"/>
+            <w:vAlign w:val="center"/>
+            <w:hideMark/>
+          </w:tcPr>
+          <w:p>
+            <w:pPr>
+              <w:spacing w:after="0" w:line="240" w:lineRule="auto"/>
+              <w:rPr>
+                <w:rFonts w:ascii="Times New Roman" w:eastAsia="Times New Roman" w:hAnsi="Times New Roman" w:cs="Times New Roman"/>
+                <w:sz w:val="24"/>
+                <w:szCs w:val="24"/>
+                <w:lang w:eastAsia="en-IN"/>
+              </w:rPr>
+            </w:pPr>
+            <w:r>
+              <w:rPr>
+                <w:rFonts w:ascii="Times New Roman" w:eastAsia="Times New Roman" w:hAnsi="Times New Roman" w:cs="Times New Roman"/>
+                <w:sz w:val="24"/>
+                <w:szCs w:val="24"/>
+                <w:lang w:eastAsia="en-IN"/>
+              </w:rPr>
+              <w:t>Functional correctness</w:t>
+            </w:r>
+          </w:p>
+        </w:tc>
+      </w:tr>
+      <w:tr>
+        <w:trPr>
+          <w:tblCellSpacing w:w="15" w:type="dxa"/>
+        </w:trPr>
+        <w:tc>
+          <w:tcPr>
+            <w:tcW w:w="0" w:type="auto"/>
+            <w:vAlign w:val="center"/>
+            <w:hideMark/>
+          </w:tcPr>
+          <w:p>
+            <w:pPr>
+              <w:spacing w:after="0" w:line="240" w:lineRule="auto"/>
+              <w:rPr>
+                <w:rFonts w:ascii="Times New Roman" w:eastAsia="Times New Roman" w:hAnsi="Times New Roman" w:cs="Times New Roman"/>
+                <w:sz w:val="24"/>
+                <w:szCs w:val="24"/>
+                <w:lang w:eastAsia="en-IN"/>
+              </w:rPr>
+            </w:pPr>
+            <w:r>
+              <w:rPr>
+                <w:rFonts w:ascii="Times New Roman" w:eastAsia="Times New Roman" w:hAnsi="Times New Roman" w:cs="Times New Roman"/>
+                <w:sz w:val="24"/>
+                <w:szCs w:val="24"/>
+                <w:lang w:eastAsia="en-IN"/>
+              </w:rPr>
+              <w:t>Test coverage</w:t>
+            </w:r>
+          </w:p>
+        </w:tc>
+        <w:tc>
+          <w:tcPr>
+            <w:tcW w:w="0" w:type="auto"/>
+            <w:vAlign w:val="center"/>
+            <w:hideMark/>
+          </w:tcPr>
+          <w:p>
+            <w:pPr>
+              <w:spacing w:after="0" w:line="240" w:lineRule="auto"/>
+              <w:rPr>
+                <w:rFonts w:ascii="Times New Roman" w:eastAsia="Times New Roman" w:hAnsi="Times New Roman" w:cs="Times New Roman"/>
+                <w:sz w:val="24"/>
+                <w:szCs w:val="24"/>
+                <w:lang w:eastAsia="en-IN"/>
+              </w:rPr>
+            </w:pPr>
+            <w:r>
+              <w:rPr>
+                <w:rFonts w:ascii="Segoe UI Symbol" w:eastAsia="Times New Roman" w:hAnsi="Segoe UI Symbol" w:cs="Segoe UI Symbol"/>
+                <w:sz w:val="24"/>
+                <w:szCs w:val="24"/>
+                <w:lang w:eastAsia="en-IN"/>
+              </w:rPr>
+              <w:t>✅</w:t>
+            </w:r>
+          </w:p>
+        </w:tc>
+        <w:tc>
+          <w:tcPr>
+            <w:tcW w:w="0" w:type="auto"/>
+            <w:vAlign w:val="center"/>
+            <w:hideMark/>
+          </w:tcPr>
+          <w:p>
+            <w:pPr>
+              <w:spacing w:after="0" w:line="240" w:lineRule="auto"/>
+              <w:rPr>
+                <w:rFonts w:ascii="Times New Roman" w:eastAsia="Times New Roman" w:hAnsi="Times New Roman" w:cs="Times New Roman"/>
+                <w:sz w:val="24"/>
+                <w:szCs w:val="24"/>
+                <w:lang w:eastAsia="en-IN"/>
+              </w:rPr>
+            </w:pPr>
+            <w:r>
+              <w:rPr>
+                <w:rFonts w:ascii="Times New Roman" w:eastAsia="Times New Roman" w:hAnsi="Times New Roman" w:cs="Times New Roman"/>
+                <w:sz w:val="24"/>
+                <w:szCs w:val="24"/>
+                <w:lang w:eastAsia="en-IN"/>
+              </w:rPr>
+              <w:t>Enforce coverage threshold</w:t>
+            </w:r>
+          </w:p>
+        </w:tc>
+      </w:tr>
+      <w:tr>
+        <w:trPr>
+          <w:tblCellSpacing w:w="15" w:type="dxa"/>
+        </w:trPr>
+        <w:tc>
+          <w:tcPr>
+            <w:tcW w:w="0" w:type="auto"/>
+            <w:vAlign w:val="center"/>
+            <w:hideMark/>
+          </w:tcPr>
+          <w:p>
+            <w:pPr>
+              <w:spacing w:after="0" w:line="240" w:lineRule="auto"/>
+              <w:rPr>
+                <w:rFonts w:ascii="Times New Roman" w:eastAsia="Times New Roman" w:hAnsi="Times New Roman" w:cs="Times New Roman"/>
+                <w:sz w:val="24"/>
+                <w:szCs w:val="24"/>
+                <w:lang w:eastAsia="en-IN"/>
+              </w:rPr>
+            </w:pPr>
+            <w:proofErr w:type="spellStart"/>
+            <w:r>
+              <w:rPr>
+                <w:rFonts w:ascii="Times New Roman" w:eastAsia="Times New Roman" w:hAnsi="Times New Roman" w:cs="Times New Roman"/>
+                <w:sz w:val="24"/>
+                <w:szCs w:val="24"/>
+                <w:lang w:eastAsia="en-IN"/>
+              </w:rPr>
+              <w:t>Gitleaks</w:t>
+            </w:r>
+            <w:proofErr w:type="spellEnd"/>
+          </w:p>
+        </w:tc>
+        <w:tc>
+          <w:tcPr>
+            <w:tcW w:w="0" w:type="auto"/>
+            <w:vAlign w:val="center"/>
+            <w:hideMark/>
+          </w:tcPr>
+          <w:p>
+            <w:pPr>
+              <w:spacing w:after="0" w:line="240" w:lineRule="auto"/>
+              <w:rPr>
+                <w:rFonts w:ascii="Times New Roman" w:eastAsia="Times New Roman" w:hAnsi="Times New Roman" w:cs="Times New Roman"/>
+                <w:sz w:val="24"/>
+                <w:szCs w:val="24"/>
+                <w:lang w:eastAsia="en-IN"/>
+              </w:rPr>
+            </w:pPr>
+            <w:r>
+              <w:rPr>
+                <w:rFonts w:ascii="Segoe UI Symbol" w:eastAsia="Times New Roman" w:hAnsi="Segoe UI Symbol" w:cs="Segoe UI Symbol"/>
+                <w:sz w:val="24"/>
+                <w:szCs w:val="24"/>
+                <w:lang w:eastAsia="en-IN"/>
+              </w:rPr>
+              <w:t>✅</w:t>
+            </w:r>
+          </w:p>
+        </w:tc>
+        <w:tc>
+          <w:tcPr>
+            <w:tcW w:w="0" w:type="auto"/>
+            <w:vAlign w:val="center"/>
+            <w:hideMark/>
+          </w:tcPr>
+          <w:p>
+            <w:pPr>
+              <w:spacing w:after="0" w:line="240" w:lineRule="auto"/>
+              <w:rPr>
+                <w:rFonts w:ascii="Times New Roman" w:eastAsia="Times New Roman" w:hAnsi="Times New Roman" w:cs="Times New Roman"/>
+                <w:sz w:val="24"/>
+                <w:szCs w:val="24"/>
+                <w:lang w:eastAsia="en-IN"/>
+              </w:rPr>
+            </w:pPr>
+            <w:r>
+              <w:rPr>
+                <w:rFonts w:ascii="Times New Roman" w:eastAsia="Times New Roman" w:hAnsi="Times New Roman" w:cs="Times New Roman"/>
+                <w:sz w:val="24"/>
+                <w:szCs w:val="24"/>
+                <w:lang w:eastAsia="en-IN"/>
+              </w:rPr>
+              <w:t>Detect committed secrets</w:t>
+            </w:r>
+          </w:p>
+        </w:tc>
+      </w:tr>
+      <w:tr>
+        <w:trPr>
+          <w:tblCellSpacing w:w="15" w:type="dxa"/>
+        </w:trPr>
+        <w:tc>
+          <w:tcPr>
+            <w:tcW w:w="0" w:type="auto"/>
+            <w:vAlign w:val="center"/>
+            <w:hideMark/>
+          </w:tcPr>
+          <w:p>
+            <w:pPr>
+              <w:spacing w:after="0" w:line="240" w:lineRule="auto"/>
+              <w:rPr>
+                <w:rFonts w:ascii="Times New Roman" w:eastAsia="Times New Roman" w:hAnsi="Times New Roman" w:cs="Times New Roman"/>
+                <w:sz w:val="24"/>
+                <w:szCs w:val="24"/>
+                <w:lang w:eastAsia="en-IN"/>
+              </w:rPr>
+            </w:pPr>
+            <w:r>
+              <w:rPr>
+                <w:rFonts w:ascii="Times New Roman" w:eastAsia="Times New Roman" w:hAnsi="Times New Roman" w:cs="Times New Roman"/>
+                <w:sz w:val="24"/>
+                <w:szCs w:val="24"/>
+                <w:lang w:eastAsia="en-IN"/>
+              </w:rPr>
+              <w:t>Dependency vulnerability scan</w:t>
+            </w:r>
+          </w:p>
+        </w:tc>
+        <w:tc>
+          <w:tcPr>
+            <w:tcW w:w="0" w:type="auto"/>
+            <w:vAlign w:val="center"/>
+            <w:hideMark/>
+          </w:tcPr>
+          <w:p>
+            <w:pPr>
+              <w:spacing w:after="0" w:line="240" w:lineRule="auto"/>
+              <w:rPr>
+                <w:rFonts w:ascii="Times New Roman" w:eastAsia="Times New Roman" w:hAnsi="Times New Roman" w:cs="Times New Roman"/>
+                <w:sz w:val="24"/>
+                <w:szCs w:val="24"/>
+                <w:lang w:eastAsia="en-IN"/>
+              </w:rPr>
+            </w:pPr>
+            <w:r>
+              <w:rPr>
+                <w:rFonts w:ascii="Segoe UI Symbol" w:eastAsia="Times New Roman" w:hAnsi="Segoe UI Symbol" w:cs="Segoe UI Symbol"/>
+                <w:sz w:val="24"/>
+                <w:szCs w:val="24"/>
+                <w:lang w:eastAsia="en-IN"/>
+              </w:rPr>
+              <w:t>✅</w:t>
+            </w:r>
+          </w:p>
+        </w:tc>
+        <w:tc>
+          <w:tcPr>
+            <w:tcW w:w="0" w:type="auto"/>
+            <w:vAlign w:val="center"/>
+            <w:hideMark/>
+          </w:tcPr>
+          <w:p>
+            <w:pPr>
+              <w:spacing w:after="0" w:line="240" w:lineRule="auto"/>
+              <w:rPr>
+                <w:rFonts w:ascii="Times New Roman" w:eastAsia="Times New Roman" w:hAnsi="Times New Roman" w:cs="Times New Roman"/>
+                <w:sz w:val="24"/>
+                <w:szCs w:val="24"/>
+                <w:lang w:eastAsia="en-IN"/>
+              </w:rPr>
+            </w:pPr>
+            <w:r>
+              <w:rPr>
+                <w:rFonts w:ascii="Times New Roman" w:eastAsia="Times New Roman" w:hAnsi="Times New Roman" w:cs="Times New Roman"/>
+                <w:sz w:val="24"/>
+                <w:szCs w:val="24"/>
+                <w:lang w:eastAsia="en-IN"/>
+              </w:rPr>
+              <w:t>Known CVEs in libraries</w:t>
+            </w:r>
+          </w:p>
+        </w:tc>
+      </w:tr>
+      <w:tr>
+        <w:trPr>
+          <w:tblCellSpacing w:w="15" w:type="dxa"/>
+        </w:trPr>
+        <w:tc>
+          <w:tcPr>
+            <w:tcW w:w="0" w:type="auto"/>
+            <w:vAlign w:val="center"/>
+            <w:hideMark/>
+          </w:tcPr>
+          <w:p>
+            <w:pPr>
+              <w:spacing w:after="0" w:line="240" w:lineRule="auto"/>
+              <w:rPr>
+                <w:rFonts w:ascii="Times New Roman" w:eastAsia="Times New Roman" w:hAnsi="Times New Roman" w:cs="Times New Roman"/>
+                <w:sz w:val="24"/>
+                <w:szCs w:val="24"/>
+                <w:lang w:eastAsia="en-IN"/>
+              </w:rPr>
+            </w:pPr>
+            <w:r>
+              <w:rPr>
+                <w:rFonts w:ascii="Times New Roman" w:eastAsia="Times New Roman" w:hAnsi="Times New Roman" w:cs="Times New Roman"/>
+                <w:sz w:val="24"/>
+                <w:szCs w:val="24"/>
+                <w:lang w:eastAsia="en-IN"/>
+              </w:rPr>
+              <w:t>Docker build</w:t>
+            </w:r>
+          </w:p>
+        </w:tc>
+        <w:tc>
+          <w:tcPr>
+            <w:tcW w:w="0" w:type="auto"/>
+            <w:vAlign w:val="center"/>
+            <w:hideMark/>
+          </w:tcPr>
+          <w:p>
+            <w:pPr>
+              <w:spacing w:after="0" w:line="240" w:lineRule="auto"/>
+              <w:rPr>
+                <w:rFonts w:ascii="Times New Roman" w:eastAsia="Times New Roman" w:hAnsi="Times New Roman" w:cs="Times New Roman"/>
+                <w:sz w:val="24"/>
+                <w:szCs w:val="24"/>
+                <w:lang w:eastAsia="en-IN"/>
+              </w:rPr>
+            </w:pPr>
+            <w:r>
+              <w:rPr>
+                <w:rFonts w:ascii="Segoe UI Symbol" w:eastAsia="Times New Roman" w:hAnsi="Segoe UI Symbol" w:cs="Segoe UI Symbol"/>
+                <w:sz w:val="24"/>
+                <w:szCs w:val="24"/>
+                <w:lang w:eastAsia="en-IN"/>
+              </w:rPr>
+              <w:t>✅</w:t>
+            </w:r>
+          </w:p>
+        </w:tc>
+        <w:tc>
+          <w:tcPr>
+            <w:tcW w:w="0" w:type="auto"/>
+            <w:vAlign w:val="center"/>
+            <w:hideMark/>
+          </w:tcPr>
+          <w:p>
+            <w:pPr>
+              <w:spacing w:after="0" w:line="240" w:lineRule="auto"/>
+              <w:rPr>
+                <w:rFonts w:ascii="Times New Roman" w:eastAsia="Times New Roman" w:hAnsi="Times New Roman" w:cs="Times New Roman"/>
+                <w:sz w:val="24"/>
+                <w:szCs w:val="24"/>
+                <w:lang w:eastAsia="en-IN"/>
+              </w:rPr>
+            </w:pPr>
+            <w:r>
+              <w:rPr>
+                <w:rFonts w:ascii="Times New Roman" w:eastAsia="Times New Roman" w:hAnsi="Times New Roman" w:cs="Times New Roman"/>
+                <w:sz w:val="24"/>
+                <w:szCs w:val="24"/>
+                <w:lang w:eastAsia="en-IN"/>
+              </w:rPr>
+              <w:t>Validate containerization</w:t>
+            </w:r>
+          </w:p>
+        </w:tc>
+      </w:tr>
+      <w:tr>
+        <w:trPr>
+          <w:tblCellSpacing w:w="15" w:type="dxa"/>
+        </w:trPr>
+        <w:tc>
+          <w:tcPr>
+            <w:tcW w:w="0" w:type="auto"/>
+            <w:vAlign w:val="center"/>
+            <w:hideMark/>
+          </w:tcPr>
+          <w:p>
+            <w:pPr>
+              <w:spacing w:after="0" w:line="240" w:lineRule="auto"/>
+              <w:rPr>
+                <w:rFonts w:ascii="Times New Roman" w:eastAsia="Times New Roman" w:hAnsi="Times New Roman" w:cs="Times New Roman"/>
+                <w:sz w:val="24"/>
+                <w:szCs w:val="24"/>
+                <w:lang w:eastAsia="en-IN"/>
+              </w:rPr>
+            </w:pPr>
+            <w:r>
+              <w:rPr>
+                <w:rFonts w:ascii="Times New Roman" w:eastAsia="Times New Roman" w:hAnsi="Times New Roman" w:cs="Times New Roman"/>
+                <w:sz w:val="24"/>
+                <w:szCs w:val="24"/>
+                <w:lang w:eastAsia="en-IN"/>
+              </w:rPr>
+              <w:t>Container image scan</w:t>
+            </w:r>
+          </w:p>
+        </w:tc>
+        <w:tc>
+          <w:tcPr>
+            <w:tcW w:w="0" w:type="auto"/>
+            <w:vAlign w:val="center"/>
+            <w:hideMark/>
+          </w:tcPr>
+          <w:p>
+            <w:pPr>
+              <w:spacing w:after="0" w:line="240" w:lineRule="auto"/>
+              <w:rPr>
+                <w:rFonts w:ascii="Times New Roman" w:eastAsia="Times New Roman" w:hAnsi="Times New Roman" w:cs="Times New Roman"/>
+                <w:sz w:val="24"/>
+                <w:szCs w:val="24"/>
+                <w:lang w:eastAsia="en-IN"/>
+              </w:rPr>
+            </w:pPr>
+            <w:r>
+              <w:rPr>
+                <w:rFonts w:ascii="Segoe UI Symbol" w:eastAsia="Times New Roman" w:hAnsi="Segoe UI Symbol" w:cs="Segoe UI Symbol"/>
+                <w:sz w:val="24"/>
+                <w:szCs w:val="24"/>
+                <w:lang w:eastAsia="en-IN"/>
+              </w:rPr>
+              <w:t>✅</w:t>
+            </w:r>
+          </w:p>
+        </w:tc>
+        <w:tc>
+          <w:tcPr>
+            <w:tcW w:w="0" w:type="auto"/>
+            <w:vAlign w:val="center"/>
+            <w:hideMark/>
+          </w:tcPr>
+          <w:p>
+            <w:pPr>
+              <w:spacing w:after="0" w:line="240" w:lineRule="auto"/>
+              <w:rPr>
+                <w:rFonts w:ascii="Times New Roman" w:eastAsia="Times New Roman" w:hAnsi="Times New Roman" w:cs="Times New Roman"/>
+                <w:sz w:val="24"/>
+                <w:szCs w:val="24"/>
+                <w:lang w:eastAsia="en-IN"/>
+              </w:rPr>
+            </w:pPr>
+            <w:r>
+              <w:rPr>
+                <w:rFonts w:ascii="Times New Roman" w:eastAsia="Times New Roman" w:hAnsi="Times New Roman" w:cs="Times New Roman"/>
+                <w:sz w:val="24"/>
+                <w:szCs w:val="24"/>
+                <w:lang w:eastAsia="en-IN"/>
+              </w:rPr>
+              <w:t>Scan built image for vulnerabilities</w:t>
+            </w:r>
+          </w:p>
+        </w:tc>
+      </w:tr>
+      <w:tr>
+        <w:trPr>
+          <w:tblCellSpacing w:w="15" w:type="dxa"/>
+        </w:trPr>
+        <w:tc>
+          <w:tcPr>
+            <w:tcW w:w="0" w:type="auto"/>
+            <w:vAlign w:val="center"/>
+            <w:hideMark/>
+          </w:tcPr>
+          <w:p>
+            <w:pPr>
+              <w:spacing w:after="0" w:line="240" w:lineRule="auto"/>
+              <w:rPr>
+                <w:rFonts w:ascii="Times New Roman" w:eastAsia="Times New Roman" w:hAnsi="Times New Roman" w:cs="Times New Roman"/>
+                <w:sz w:val="24"/>
+                <w:szCs w:val="24"/>
+                <w:lang w:eastAsia="en-IN"/>
+              </w:rPr>
+            </w:pPr>
+            <w:r>
+              <w:rPr>
+                <w:rFonts w:ascii="Times New Roman" w:eastAsia="Times New Roman" w:hAnsi="Times New Roman" w:cs="Times New Roman"/>
+                <w:sz w:val="24"/>
+                <w:szCs w:val="24"/>
+                <w:lang w:eastAsia="en-IN"/>
+              </w:rPr>
+              <w:t>SBOM generation</w:t>
+            </w:r>
+          </w:p>
+        </w:tc>
+        <w:tc>
+          <w:tcPr>
+            <w:tcW w:w="0" w:type="auto"/>
+            <w:vAlign w:val="center"/>
+            <w:hideMark/>
+          </w:tcPr>
+          <w:p>
+            <w:pPr>
+              <w:spacing w:after="0" w:line="240" w:lineRule="auto"/>
+              <w:rPr>
+                <w:rFonts w:ascii="Times New Roman" w:eastAsia="Times New Roman" w:hAnsi="Times New Roman" w:cs="Times New Roman"/>
+                <w:sz w:val="24"/>
+                <w:szCs w:val="24"/>
+                <w:lang w:eastAsia="en-IN"/>
+              </w:rPr>
+            </w:pPr>
+            <w:r>
+              <w:rPr>
+                <w:rFonts w:ascii="Segoe UI Symbol" w:eastAsia="Times New Roman" w:hAnsi="Segoe UI Symbol" w:cs="Segoe UI Symbol"/>
+                <w:sz w:val="24"/>
+                <w:szCs w:val="24"/>
+                <w:lang w:eastAsia="en-IN"/>
+              </w:rPr>
+              <w:t>✅</w:t>
+            </w:r>
+          </w:p>
+        </w:tc>
+        <w:tc>
+          <w:tcPr>
+            <w:tcW w:w="0" w:type="auto"/>
+            <w:vAlign w:val="center"/>
+            <w:hideMark/>
+          </w:tcPr>
+          <w:p>
+            <w:pPr>
+              <w:spacing w:after="0" w:line="240" w:lineRule="auto"/>
+              <w:rPr>
+                <w:rFonts w:ascii="Times New Roman" w:eastAsia="Times New Roman" w:hAnsi="Times New Roman" w:cs="Times New Roman"/>
+                <w:sz w:val="24"/>
+                <w:szCs w:val="24"/>
+                <w:lang w:eastAsia="en-IN"/>
+              </w:rPr>
+            </w:pPr>
+            <w:r>
+              <w:rPr>
+                <w:rFonts w:ascii="Times New Roman" w:eastAsia="Times New Roman" w:hAnsi="Times New Roman" w:cs="Times New Roman"/>
+                <w:sz w:val="24"/>
+                <w:szCs w:val="24"/>
+                <w:lang w:eastAsia="en-IN"/>
+              </w:rPr>
+              <w:t>Software bill of materials</w:t>
+            </w:r>
+          </w:p>
+        </w:tc>
+      </w:tr>
+      <w:tr>
+        <w:trPr>
+          <w:tblCellSpacing w:w="15" w:type="dxa"/>
+        </w:trPr>
+        <w:tc>
+          <w:tcPr>
+            <w:tcW w:w="0" w:type="auto"/>
+            <w:vAlign w:val="center"/>
+            <w:hideMark/>
+          </w:tcPr>
+          <w:p>
+            <w:pPr>
+              <w:spacing w:after="0" w:line="240" w:lineRule="auto"/>
+              <w:rPr>
+                <w:rFonts w:ascii="Times New Roman" w:eastAsia="Times New Roman" w:hAnsi="Times New Roman" w:cs="Times New Roman"/>
+                <w:sz w:val="24"/>
+                <w:szCs w:val="24"/>
+                <w:lang w:eastAsia="en-IN"/>
+              </w:rPr>
+            </w:pPr>
+            <w:r>
+              <w:rPr>
+                <w:rFonts w:ascii="Times New Roman" w:eastAsia="Times New Roman" w:hAnsi="Times New Roman" w:cs="Times New Roman"/>
+                <w:sz w:val="24"/>
+                <w:szCs w:val="24"/>
+                <w:lang w:eastAsia="en-IN"/>
+              </w:rPr>
+              <w:t>Image signing (Release only)</w:t>
+            </w:r>
+          </w:p>
+        </w:tc>
+        <w:tc>
+          <w:tcPr>
+            <w:tcW w:w="0" w:type="auto"/>
+            <w:vAlign w:val="center"/>
+            <w:hideMark/>
+          </w:tcPr>
+          <w:p>
+            <w:pPr>
+              <w:spacing w:after="0" w:line="240" w:lineRule="auto"/>
+              <w:rPr>
+                <w:rFonts w:ascii="Times New Roman" w:eastAsia="Times New Roman" w:hAnsi="Times New Roman" w:cs="Times New Roman"/>
+                <w:sz w:val="24"/>
+                <w:szCs w:val="24"/>
+                <w:lang w:eastAsia="en-IN"/>
+              </w:rPr>
+            </w:pPr>
+            <w:r>
+              <w:rPr>
+                <w:rFonts w:ascii="Segoe UI Symbol" w:eastAsia="Times New Roman" w:hAnsi="Segoe UI Symbol" w:cs="Segoe UI Symbol"/>
+                <w:sz w:val="24"/>
+                <w:szCs w:val="24"/>
+                <w:lang w:eastAsia="en-IN"/>
+              </w:rPr>
+              <w:t>✅</w:t>
+            </w:r>
+          </w:p>
+        </w:tc>
+        <w:tc>
+          <w:tcPr>
+            <w:tcW w:w="0" w:type="auto"/>
+            <w:vAlign w:val="center"/>
+            <w:hideMark/>
+          </w:tcPr>
+          <w:p>
+            <w:pPr>
+              <w:spacing w:after="0" w:line="240" w:lineRule="auto"/>
+              <w:rPr>
+                <w:rFonts w:ascii="Times New Roman" w:eastAsia="Times New Roman" w:hAnsi="Times New Roman" w:cs="Times New Roman"/>
+                <w:sz w:val="24"/>
+                <w:szCs w:val="24"/>
+                <w:lang w:eastAsia="en-IN"/>
+              </w:rPr>
+            </w:pPr>
+            <w:r>
+              <w:rPr>
+                <w:rFonts w:ascii="Times New Roman" w:eastAsia="Times New Roman" w:hAnsi="Times New Roman" w:cs="Times New Roman"/>
+                <w:sz w:val="24"/>
+                <w:szCs w:val="24"/>
+                <w:lang w:eastAsia="en-IN"/>
+              </w:rPr>
+              <w:t>Supply-chain integrity</w:t>
+            </w:r>
+          </w:p>
+        </w:tc>
+      </w:tr>
+      <w:tr>
+        <w:trPr>
+          <w:tblCellSpacing w:w="15" w:type="dxa"/>
+        </w:trPr>
+        <w:tc>
+          <w:tcPr>
+            <w:tcW w:w="0" w:type="auto"/>
+            <w:vAlign w:val="center"/>
+            <w:hideMark/>
+          </w:tcPr>
+          <w:p>
+            <w:pPr>
+              <w:spacing w:after="0" w:line="240" w:lineRule="auto"/>
+              <w:rPr>
+                <w:rFonts w:ascii="Times New Roman" w:eastAsia="Times New Roman" w:hAnsi="Times New Roman" w:cs="Times New Roman"/>
+                <w:sz w:val="24"/>
+                <w:szCs w:val="24"/>
+                <w:lang w:eastAsia="en-IN"/>
+              </w:rPr>
+            </w:pPr>
+            <w:r>
+              <w:rPr>
+                <w:rFonts w:ascii="Times New Roman" w:eastAsia="Times New Roman" w:hAnsi="Times New Roman" w:cs="Times New Roman"/>
+                <w:sz w:val="24"/>
+                <w:szCs w:val="24"/>
+                <w:lang w:eastAsia="en-IN"/>
+              </w:rPr>
+              <w:t>Publish image</w:t>
+            </w:r>
+          </w:p>
+        </w:tc>
+        <w:tc>
+          <w:tcPr>
+            <w:tcW w:w="0" w:type="auto"/>
+            <w:vAlign w:val="center"/>
+            <w:hideMark/>
+          </w:tcPr>
+          <w:p>
+            <w:pPr>
+              <w:spacing w:after="0" w:line="240" w:lineRule="auto"/>
+              <w:rPr>
+                <w:rFonts w:ascii="Times New Roman" w:eastAsia="Times New Roman" w:hAnsi="Times New Roman" w:cs="Times New Roman"/>
+                <w:sz w:val="24"/>
+                <w:szCs w:val="24"/>
+                <w:lang w:eastAsia="en-IN"/>
+              </w:rPr>
+            </w:pPr>
+            <w:r>
+              <w:rPr>
+                <w:rFonts w:ascii="Segoe UI Symbol" w:eastAsia="Times New Roman" w:hAnsi="Segoe UI Symbol" w:cs="Segoe UI Symbol"/>
+                <w:sz w:val="24"/>
+                <w:szCs w:val="24"/>
+                <w:lang w:eastAsia="en-IN"/>
+              </w:rPr>
+              <w:t>✅</w:t>
+            </w:r>
+          </w:p>
+        </w:tc>
+        <w:tc>
+          <w:tcPr>
+            <w:tcW w:w="0" w:type="auto"/>
+            <w:vAlign w:val="center"/>
+            <w:hideMark/>
+          </w:tcPr>
+          <w:p>
+            <w:pPr>
+              <w:spacing w:after="0" w:line="240" w:lineRule="auto"/>
+              <w:rPr>
+                <w:rFonts w:ascii="Times New Roman" w:eastAsia="Times New Roman" w:hAnsi="Times New Roman" w:cs="Times New Roman"/>
+                <w:sz w:val="24"/>
+                <w:szCs w:val="24"/>
+                <w:lang w:eastAsia="en-IN"/>
+              </w:rPr>
+            </w:pPr>
+            <w:r>
+              <w:rPr>
+                <w:rFonts w:ascii="Times New Roman" w:eastAsia="Times New Roman" w:hAnsi="Times New Roman" w:cs="Times New Roman"/>
+                <w:sz w:val="24"/>
+                <w:szCs w:val="24"/>
+                <w:lang w:eastAsia="en-IN"/>
+              </w:rPr>
+              <w:t xml:space="preserve">Store immutable </w:t>
+            </w:r>
+            <w:proofErr w:type="spellStart"/>
+            <w:r>
+              <w:rPr>
+                <w:rFonts w:ascii="Times New Roman" w:eastAsia="Times New Roman" w:hAnsi="Times New Roman" w:cs="Times New Roman"/>
+                <w:sz w:val="24"/>
+                <w:szCs w:val="24"/>
+                <w:lang w:eastAsia="en-IN"/>
+              </w:rPr>
+              <w:t>artifact</w:t>
+            </w:r>
+            <w:proofErr w:type="spellEnd"/>
+          </w:p>
+        </w:tc>
+      </w:tr>
+      <w:tr>
+        <w:trPr>
+          <w:tblCellSpacing w:w="15" w:type="dxa"/>
+        </w:trPr>
+        <w:tc>
+          <w:tcPr>
+            <w:tcW w:w="0" w:type="auto"/>
+            <w:vAlign w:val="center"/>
+            <w:hideMark/>
+          </w:tcPr>
+          <w:p>
+            <w:pPr>
+              <w:spacing w:after="0" w:line="240" w:lineRule="auto"/>
+              <w:rPr>
+                <w:rFonts w:ascii="Times New Roman" w:eastAsia="Times New Roman" w:hAnsi="Times New Roman" w:cs="Times New Roman"/>
+                <w:sz w:val="24"/>
+                <w:szCs w:val="24"/>
+                <w:lang w:eastAsia="en-IN"/>
+              </w:rPr>
+            </w:pPr>
+            <w:r>
+              <w:rPr>
+                <w:rFonts w:ascii="Times New Roman" w:eastAsia="Times New Roman" w:hAnsi="Times New Roman" w:cs="Times New Roman"/>
+                <w:sz w:val="24"/>
+                <w:szCs w:val="24"/>
+                <w:lang w:eastAsia="en-IN"/>
+              </w:rPr>
+              <w:t xml:space="preserve">Update </w:t>
+            </w:r>
+            <w:proofErr w:type="spellStart"/>
+            <w:r>
+              <w:rPr>
+                <w:rFonts w:ascii="Times New Roman" w:eastAsia="Times New Roman" w:hAnsi="Times New Roman" w:cs="Times New Roman"/>
+                <w:sz w:val="24"/>
+                <w:szCs w:val="24"/>
+                <w:lang w:eastAsia="en-IN"/>
+              </w:rPr>
+              <w:t>GitOps</w:t>
+            </w:r>
+            <w:proofErr w:type="spellEnd"/>
+          </w:p>
+        </w:tc>
+        <w:tc>
+          <w:tcPr>
+            <w:tcW w:w="0" w:type="auto"/>
+            <w:vAlign w:val="center"/>
+            <w:hideMark/>
+          </w:tcPr>
+          <w:p>
+            <w:pPr>
+              <w:spacing w:after="0" w:line="240" w:lineRule="auto"/>
+              <w:rPr>
+                <w:rFonts w:ascii="Times New Roman" w:eastAsia="Times New Roman" w:hAnsi="Times New Roman" w:cs="Times New Roman"/>
+                <w:sz w:val="24"/>
+                <w:szCs w:val="24"/>
+                <w:lang w:eastAsia="en-IN"/>
+              </w:rPr>
+            </w:pPr>
+            <w:r>
+              <w:rPr>
+                <w:rFonts w:ascii="Segoe UI Symbol" w:eastAsia="Times New Roman" w:hAnsi="Segoe UI Symbol" w:cs="Segoe UI Symbol"/>
+                <w:sz w:val="24"/>
+                <w:szCs w:val="24"/>
+                <w:lang w:eastAsia="en-IN"/>
+              </w:rPr>
+              <w:t>✅</w:t>
+            </w:r>
+          </w:p>
+        </w:tc>
+        <w:tc>
+          <w:tcPr>
+            <w:tcW w:w="0" w:type="auto"/>
+            <w:vAlign w:val="center"/>
+            <w:hideMark/>
+          </w:tcPr>
+          <w:p>
+            <w:pPr>
+              <w:spacing w:after="0" w:line="240" w:lineRule="auto"/>
+              <w:rPr>
+                <w:rFonts w:ascii="Times New Roman" w:eastAsia="Times New Roman" w:hAnsi="Times New Roman" w:cs="Times New Roman"/>
+                <w:sz w:val="24"/>
+                <w:szCs w:val="24"/>
+                <w:lang w:eastAsia="en-IN"/>
+              </w:rPr>
+            </w:pPr>
+            <w:r>
+              <w:rPr>
+                <w:rFonts w:ascii="Times New Roman" w:eastAsia="Times New Roman" w:hAnsi="Times New Roman" w:cs="Times New Roman"/>
+                <w:sz w:val="24"/>
+                <w:szCs w:val="24"/>
+                <w:lang w:eastAsia="en-IN"/>
+              </w:rPr>
+              <w:t xml:space="preserve">Promote </w:t>
+            </w:r>
+            <w:proofErr w:type="spellStart"/>
+            <w:r>
+              <w:rPr>
+                <w:rFonts w:ascii="Times New Roman" w:eastAsia="Times New Roman" w:hAnsi="Times New Roman" w:cs="Times New Roman"/>
+                <w:sz w:val="24"/>
+                <w:szCs w:val="24"/>
+                <w:lang w:eastAsia="en-IN"/>
+              </w:rPr>
+              <w:t>artifact</w:t>
+            </w:r>
+            <w:proofErr w:type="spellEnd"/>
+            <w:r>
+              <w:rPr>
+                <w:rFonts w:ascii="Times New Roman" w:eastAsia="Times New Roman" w:hAnsi="Times New Roman" w:cs="Times New Roman"/>
+                <w:sz w:val="24"/>
+                <w:szCs w:val="24"/>
+                <w:lang w:eastAsia="en-IN"/>
+              </w:rPr>
+              <w:t xml:space="preserve"> via </w:t>
+            </w:r>
+            <w:proofErr w:type="spellStart"/>
+            <w:r>
+              <w:rPr>
+                <w:rFonts w:ascii="Times New Roman" w:eastAsia="Times New Roman" w:hAnsi="Times New Roman" w:cs="Times New Roman"/>
+                <w:sz w:val="24"/>
+                <w:szCs w:val="24"/>
+                <w:lang w:eastAsia="en-IN"/>
+              </w:rPr>
+              <w:t>GitOps</w:t>
+            </w:r>
+            <w:proofErr w:type="spellEnd"/>
+          </w:p>
+        </w:tc>
+      </w:tr>
+    </w:tbl>
+    <w:p/>
     <w:sectPr>
       <w:pgSz w:w="11906" w:h="16838"/>
       <w:pgMar w:top="1440" w:right="1440" w:bottom="1440" w:left="1440" w:header="708" w:footer="708" w:gutter="0"/>

</xml_diff>